<commit_message>
Format bullets with bracketed capital headers
Co-Authored-By: Claude Opus 5.5 <noreply@anthropic.com>
Claude-Session: https://claude.ai/code/session_017N3bie9BBAp3B5XmsFWBiw
</commit_message>
<xml_diff>
--- a/tapsa-aqualock/listing/Tapsa_24x4_Tile_Insert_Floor_Drain_Amazon_Listing_Final.docx
+++ b/tapsa-aqualock/listing/Tapsa_24x4_Tile_Insert_Floor_Drain_Amazon_Listing_Final.docx
@@ -245,7 +245,7 @@
           <w:sz w:val="23"/>
           <w:szCs w:val="23"/>
         </w:rPr>
-        <w:t xml:space="preserve">Bullet 1: Invisible Tile Insert Look, Two Finishes in One Cover</w:t>
+        <w:t xml:space="preserve">Bullet 1: INVISIBLE TILE INSERT &amp; 2-IN-1 REVERSIBLE COVER</w:t>
       </w:r>
     </w:p>
     <w:p>
@@ -261,7 +261,7 @@
           <w:sz w:val="18"/>
           <w:szCs w:val="18"/>
         </w:rPr>
-        <w:t xml:space="preserve">521 / 700 characters</w:t>
+        <w:t xml:space="preserve">516 / 700 characters</w:t>
       </w:r>
     </w:p>
     <w:p>
@@ -283,7 +283,7 @@
           <w:sz w:val="21"/>
           <w:szCs w:val="21"/>
         </w:rPr>
-        <w:t xml:space="preserve">Invisible Tile Insert Look, Two Finishes in One Cover: Set your own floor tile, marble or granite, 10 to 21 mm thick and cut to 585 x 85 mm, into the cover tray and this tile insert floor drain blends into the bathroom floor, leaving only a slim stainless steel line. For a modern metal look, flip the reversible 2-in-1 cover to show its brushed matte stainless steel surface. One shower drain channel, two distinctive looks, ideal for marble bathrooms, minimal modern interiors and renovations without changing the drain</w:t>
+        <w:t xml:space="preserve">【INVISIBLE TILE INSERT &amp; 2-IN-1 REVERSIBLE COVER】 Set your own floor tile, marble or granite, 10 to 21 mm thick and cut to 585 x 85 mm, into the cover tray and this tile insert floor drain blends into the bathroom floor, leaving only a slim stainless steel line. For a modern metal look, flip the reversible 2-in-1 cover to show its brushed matte stainless steel surface. One shower drain channel, two distinctive looks, ideal for marble bathrooms, minimal modern interiors and renovations without changing the drain</w:t>
       </w:r>
     </w:p>
     <w:p>
@@ -300,7 +300,7 @@
           <w:sz w:val="23"/>
           <w:szCs w:val="23"/>
         </w:rPr>
-        <w:t xml:space="preserve">Bullet 2: AquaLock Anti Cockroach and Anti Smell Water Seal Trap</w:t>
+        <w:t xml:space="preserve">Bullet 2: ANTI COCKROACH &amp; ANTI SMELL WATER SEAL TRAP</w:t>
       </w:r>
     </w:p>
     <w:p>
@@ -316,7 +316,7 @@
           <w:sz w:val="18"/>
           <w:szCs w:val="18"/>
         </w:rPr>
-        <w:t xml:space="preserve">573 / 700 characters</w:t>
+        <w:t xml:space="preserve">563 / 700 characters</w:t>
       </w:r>
     </w:p>
     <w:p>
@@ -338,7 +338,7 @@
           <w:sz w:val="21"/>
           <w:szCs w:val="21"/>
         </w:rPr>
-        <w:t xml:space="preserve">AquaLock Anti Cockroach and Anti Smell Water Seal Trap: Water passes through the slotted strainer into the inner cup, flows beneath it and exits through the side openings, while a layer of water stays held in the bowl as a water seal. This retained seal helps block sewer gas smell, cockroaches and small insects from coming up through the drain pipe. There is no spring, hinge or moving flap to rust, jam or break, so the seal keeps working as long as it stays filled. In a guest or rarely used bathroom, pour in a mug of water every week or two to keep the seal topped up</w:t>
+        <w:t xml:space="preserve">【ANTI COCKROACH &amp; ANTI SMELL WATER SEAL TRAP】 Water passes through the slotted strainer into the inner cup, flows beneath it and exits through the side openings, while a layer of water stays held in the bowl as a water seal. This retained seal helps block sewer gas smell, cockroaches and small insects from coming up through the drain pipe. There is no spring, hinge or moving flap to rust, jam or break, so the seal keeps working as long as it stays filled. In a guest or rarely used bathroom, pour in a mug of water every week or two to keep the seal topped up</w:t>
       </w:r>
     </w:p>
     <w:p>
@@ -355,7 +355,7 @@
           <w:sz w:val="23"/>
           <w:szCs w:val="23"/>
         </w:rPr>
-        <w:t xml:space="preserve">Bullet 3: Solid 304 Stainless Steel in Every Part</w:t>
+        <w:t xml:space="preserve">Bullet 3: SS304 MATERIAL &amp; MATTE FINISH</w:t>
       </w:r>
     </w:p>
     <w:p>
@@ -371,7 +371,7 @@
           <w:sz w:val="18"/>
           <w:szCs w:val="18"/>
         </w:rPr>
-        <w:t xml:space="preserve">574 / 700 characters</w:t>
+        <w:t xml:space="preserve">565 / 700 characters</w:t>
       </w:r>
     </w:p>
     <w:p>
@@ -393,7 +393,7 @@
           <w:sz w:val="21"/>
           <w:szCs w:val="21"/>
         </w:rPr>
-        <w:t xml:space="preserve">Solid 304 Stainless Steel in Every Part: The channel, reversible cover, strainer, inner bowl and outer trap body are all made from AISI 304 grade stainless steel (SS304), the grade widely used for kitchen and food processing equipment. Built from solid 1 mm thick sheet for a sturdy, rigid feel underfoot, 304 grade steel resists rust and corrosion in daily wet use far better than iron, plastic or lower grade 201 steel. Every edge is folded and deburred, with no sharp edges to cut hands while cleaning, and the premium matte finish helps hide water spots and fingerprints</w:t>
+        <w:t xml:space="preserve">【SS304 MATERIAL &amp; MATTE FINISH】 The channel, reversible cover, strainer, inner bowl and outer trap body are all made from AISI 304 grade stainless steel (SS304), the grade widely used for kitchen and food processing equipment. Built from solid 1 mm thick sheet for a sturdy, rigid feel underfoot, 304 grade steel resists rust and corrosion in daily wet use far better than iron, plastic or lower grade 201 steel. Every edge is folded and deburred, with no sharp edges to cut hands while cleaning, and the premium matte finish helps hide water spots and fingerprints</w:t>
       </w:r>
     </w:p>
     <w:p>
@@ -410,7 +410,7 @@
           <w:sz w:val="23"/>
           <w:szCs w:val="23"/>
         </w:rPr>
-        <w:t xml:space="preserve">Bullet 4: Side Hole Outlet and Exact Fitting Size</w:t>
+        <w:t xml:space="preserve">Bullet 4: SIDE HOLE OUTLET &amp; EXACT SIZE</w:t>
       </w:r>
     </w:p>
     <w:p>
@@ -426,7 +426,7 @@
           <w:sz w:val="18"/>
           <w:szCs w:val="18"/>
         </w:rPr>
-        <w:t xml:space="preserve">548 / 700 characters</w:t>
+        <w:t xml:space="preserve">539 / 700 characters</w:t>
       </w:r>
     </w:p>
     <w:p>
@@ -448,7 +448,7 @@
           <w:sz w:val="21"/>
           <w:szCs w:val="21"/>
         </w:rPr>
-        <w:t xml:space="preserve">Side Hole Outlet and Exact Fitting Size: The 75 mm outlet hole sits to the side, near one end of the channel base instead of the centre, and drains straight down into your pipe. Turn the channel to place the side hole on the left or right, directly over your existing drain pipe. Nominal size 24 x 4 inch, actual outer size 600 x 100 mm, insert area 585 x 85 mm for 10 to 21 mm tile, marble or granite, channel depth 32 mm and total height including trap 85 mm. Confirm outlet position and floor depth with your plumber before the floor bed is laid</w:t>
+        <w:t xml:space="preserve">【SIDE HOLE OUTLET &amp; EXACT SIZE】 The 75 mm outlet hole sits to the side, near one end of the channel base instead of the centre, and drains straight down into your pipe. Turn the channel to place the side hole on the left or right, directly over your existing drain pipe. Nominal size 24 x 4 inch, actual outer size 600 x 100 mm, insert area 585 x 85 mm for 10 to 21 mm tile, marble or granite, channel depth 32 mm and total height including trap 85 mm. Confirm outlet position and floor depth with your plumber before the floor bed is laid</w:t>
       </w:r>
     </w:p>
     <w:p>
@@ -465,7 +465,7 @@
           <w:sz w:val="23"/>
           <w:szCs w:val="23"/>
         </w:rPr>
-        <w:t xml:space="preserve">Bullet 5: Lift, Rinse, Refit Cleaning</w:t>
+        <w:t xml:space="preserve">Bullet 5: EASY LIFT, RINSE &amp; REFIT CLEANING</w:t>
       </w:r>
     </w:p>
     <w:p>
@@ -481,7 +481,7 @@
           <w:sz w:val="18"/>
           <w:szCs w:val="18"/>
         </w:rPr>
-        <w:t xml:space="preserve">517 / 700 characters</w:t>
+        <w:t xml:space="preserve">524 / 700 characters</w:t>
       </w:r>
     </w:p>
     <w:p>
@@ -503,7 +503,7 @@
           <w:sz w:val="21"/>
           <w:szCs w:val="21"/>
         </w:rPr>
-        <w:t xml:space="preserve">Lift, Rinse, Refit Cleaning: Hair and soap residue collect in the removable slotted strainer instead of deep inside your pipe, helping prevent slow drainage and blockages. Lift the cover, take out the strainer and inner bowl, rinse them under running water and drop them back in place. Clean the stainless steel with mild soap and water only; avoid toilet acid, hydrochloric acid and harsh bleach, which can stain any steel. After cleaning, the trap refills with water so the anti smell seal is restored straight away</w:t>
+        <w:t xml:space="preserve">【EASY LIFT, RINSE &amp; REFIT CLEANING】 Hair and soap residue collect in the removable slotted strainer instead of deep inside your pipe, helping prevent slow drainage and blockages. Lift the cover, take out the strainer and inner bowl, rinse them under running water and drop them back in place. Clean the stainless steel with mild soap and water only; avoid toilet acid, hydrochloric acid and harsh bleach, which can stain any steel. After cleaning, the trap refills with water so the anti smell seal is restored straight away</w:t>
       </w:r>
     </w:p>
     <w:p>
@@ -520,7 +520,7 @@
           <w:sz w:val="23"/>
           <w:szCs w:val="23"/>
         </w:rPr>
-        <w:t xml:space="preserve">Bullet 6: Made for Bathrooms, Showers and Wet Areas</w:t>
+        <w:t xml:space="preserve">Bullet 6: IDEAL FOR BATHROOM, SHOWER &amp; BALCONY</w:t>
       </w:r>
     </w:p>
     <w:p>
@@ -536,7 +536,7 @@
           <w:sz w:val="18"/>
           <w:szCs w:val="18"/>
         </w:rPr>
-        <w:t xml:space="preserve">454 / 700 characters</w:t>
+        <w:t xml:space="preserve">446 / 700 characters</w:t>
       </w:r>
     </w:p>
     <w:p>
@@ -558,7 +558,7 @@
           <w:sz w:val="21"/>
           <w:szCs w:val="21"/>
         </w:rPr>
-        <w:t xml:space="preserve">Made for Bathrooms, Showers and Wet Areas: Ideal for shower areas, walk-in showers, wet rooms, bathrooms, balconies and utility wash areas in new homes and renovations. A stylish upgrade from an ordinary visible bathroom jali when you want a clean, continuous tiled floor. For best results, lay the floor with a gentle slope towards the drain, keep cement and grout out of the outlet, and never grout the cover in place so it stays removable for cleaning</w:t>
+        <w:t xml:space="preserve">【IDEAL FOR BATHROOM, SHOWER &amp; BALCONY】 Suits shower areas, walk-in showers, wet rooms, bathrooms, balconies and utility wash areas in new homes and renovations. A stylish upgrade from an ordinary visible bathroom jali when you want a clean, continuous tiled floor. For best results, lay the floor with a gentle slope towards the drain, keep cement and grout out of the outlet, and never grout the cover in place so it stays removable for cleaning</w:t>
       </w:r>
     </w:p>
     <w:p>
@@ -575,7 +575,7 @@
           <w:sz w:val="23"/>
           <w:szCs w:val="23"/>
         </w:rPr>
-        <w:t xml:space="preserve">Bullet 7: Complete 5-Piece Set with Lifetime Warranty</w:t>
+        <w:t xml:space="preserve">Bullet 7: 5-PIECE SET &amp; LIFETIME WARRANTY</w:t>
       </w:r>
     </w:p>
     <w:p>
@@ -591,7 +591,7 @@
           <w:sz w:val="18"/>
           <w:szCs w:val="18"/>
         </w:rPr>
-        <w:t xml:space="preserve">451 / 700 characters</w:t>
+        <w:t xml:space="preserve">440 / 700 characters</w:t>
       </w:r>
     </w:p>
     <w:p>
@@ -613,7 +613,7 @@
           <w:sz w:val="21"/>
           <w:szCs w:val="21"/>
         </w:rPr>
-        <w:t xml:space="preserve">Complete 5-Piece Set with Lifetime Warranty: You receive the drain channel, reversible 2-in-1 cover, slotted strainer, inner water seal bowl and outer AquaLock trap body, ready to install. Floor tile or marble for the insert is not included, so you can match it exactly to your own flooring. TAPSA backs the drain channel with a lifetime limited replacement warranty, subject to its written terms, for long term peace of mind from TAPSA Luxury Bathing</w:t>
+        <w:t xml:space="preserve">【5-PIECE SET &amp; LIFETIME WARRANTY】 You receive the drain channel, reversible 2-in-1 cover, slotted strainer, inner water seal bowl and outer AquaLock trap body, ready to install. Floor tile or marble for the insert is not included, so you can match it exactly to your own flooring. TAPSA backs the drain channel with a lifetime limited replacement warranty, subject to its written terms, for long term peace of mind from TAPSA Luxury Bathing</w:t>
       </w:r>
     </w:p>
     <w:p>

</xml_diff>

<commit_message>
Bullet headers in bold serif 【HEADER】: format
Co-Authored-By: Claude Opus 5.5 <noreply@anthropic.com>
Claude-Session: https://claude.ai/code/session_017N3bie9BBAp3B5XmsFWBiw
</commit_message>
<xml_diff>
--- a/tapsa-aqualock/listing/Tapsa_24x4_Tile_Insert_Floor_Drain_Amazon_Listing_Final.docx
+++ b/tapsa-aqualock/listing/Tapsa_24x4_Tile_Insert_Floor_Drain_Amazon_Listing_Final.docx
@@ -228,7 +228,7 @@
           <w:sz w:val="18"/>
           <w:szCs w:val="18"/>
         </w:rPr>
-        <w:t xml:space="preserve">Paste each bullet into its own field, without the number.</w:t>
+        <w:t xml:space="preserve">Format: 【𝐇𝐄𝐀𝐃𝐄𝐑】: text. Headers use Unicode Bold Serif. Paste each bullet into its own field, without the number.</w:t>
       </w:r>
     </w:p>
     <w:p>
@@ -245,7 +245,7 @@
           <w:sz w:val="23"/>
           <w:szCs w:val="23"/>
         </w:rPr>
-        <w:t xml:space="preserve">Bullet 1: INVISIBLE TILE INSERT &amp; 2-IN-1 REVERSIBLE COVER</w:t>
+        <w:t xml:space="preserve">Bullet 1: 𝐈𝐍𝐕𝐈𝐒𝐈𝐁𝐋𝐄 𝟐-𝐈𝐍-𝟏 𝐂𝐎𝐕𝐄𝐑</w:t>
       </w:r>
     </w:p>
     <w:p>
@@ -261,7 +261,7 @@
           <w:sz w:val="18"/>
           <w:szCs w:val="18"/>
         </w:rPr>
-        <w:t xml:space="preserve">516 / 700 characters</w:t>
+        <w:t xml:space="preserve">492 / 700 characters (510 if Amazon counts each bold letter as 2)</w:t>
       </w:r>
     </w:p>
     <w:p>
@@ -283,7 +283,7 @@
           <w:sz w:val="21"/>
           <w:szCs w:val="21"/>
         </w:rPr>
-        <w:t xml:space="preserve">【INVISIBLE TILE INSERT &amp; 2-IN-1 REVERSIBLE COVER】 Set your own floor tile, marble or granite, 10 to 21 mm thick and cut to 585 x 85 mm, into the cover tray and this tile insert floor drain blends into the bathroom floor, leaving only a slim stainless steel line. For a modern metal look, flip the reversible 2-in-1 cover to show its brushed matte stainless steel surface. One shower drain channel, two distinctive looks, ideal for marble bathrooms, minimal modern interiors and renovations without changing the drain</w:t>
+        <w:t xml:space="preserve">【𝐈𝐍𝐕𝐈𝐒𝐈𝐁𝐋𝐄 𝟐-𝐈𝐍-𝟏 𝐂𝐎𝐕𝐄𝐑】: Set your own floor tile, marble or granite, 10 to 21 mm thick and cut to 585 x 85 mm, into the cover tray and this tile insert floor drain blends into the bathroom floor, leaving only a slim stainless steel line. For a modern metal look, flip the reversible 2-in-1 cover to show its brushed matte stainless steel surface. One shower drain channel, two distinctive looks, ideal for marble bathrooms, minimal modern interiors and renovations without changing the drain</w:t>
       </w:r>
     </w:p>
     <w:p>
@@ -300,7 +300,7 @@
           <w:sz w:val="23"/>
           <w:szCs w:val="23"/>
         </w:rPr>
-        <w:t xml:space="preserve">Bullet 2: ANTI COCKROACH &amp; ANTI SMELL WATER SEAL TRAP</w:t>
+        <w:t xml:space="preserve">Bullet 2: 𝐀𝐍𝐓𝐈 𝐂𝐎𝐂𝐊𝐑𝐎𝐀𝐂𝐇 𝐖𝐀𝐓𝐄𝐑 𝐒𝐄𝐀𝐋</w:t>
       </w:r>
     </w:p>
     <w:p>
@@ -316,7 +316,7 @@
           <w:sz w:val="18"/>
           <w:szCs w:val="18"/>
         </w:rPr>
-        <w:t xml:space="preserve">563 / 700 characters</w:t>
+        <w:t xml:space="preserve">546 / 700 characters (568 if Amazon counts each bold letter as 2)</w:t>
       </w:r>
     </w:p>
     <w:p>
@@ -338,7 +338,7 @@
           <w:sz w:val="21"/>
           <w:szCs w:val="21"/>
         </w:rPr>
-        <w:t xml:space="preserve">【ANTI COCKROACH &amp; ANTI SMELL WATER SEAL TRAP】 Water passes through the slotted strainer into the inner cup, flows beneath it and exits through the side openings, while a layer of water stays held in the bowl as a water seal. This retained seal helps block sewer gas smell, cockroaches and small insects from coming up through the drain pipe. There is no spring, hinge or moving flap to rust, jam or break, so the seal keeps working as long as it stays filled. In a guest or rarely used bathroom, pour in a mug of water every week or two to keep the seal topped up</w:t>
+        <w:t xml:space="preserve">【𝐀𝐍𝐓𝐈 𝐂𝐎𝐂𝐊𝐑𝐎𝐀𝐂𝐇 𝐖𝐀𝐓𝐄𝐑 𝐒𝐄𝐀𝐋】: Water passes through the slotted strainer into the inner cup, flows beneath it and exits through the side openings, while a layer of water stays held in the bowl as a water seal. This retained seal helps block sewer gas smell, cockroaches and small insects from coming up through the drain pipe. There is no spring, hinge or moving flap to rust, jam or break, so the seal keeps working as long as it stays filled. In a guest or rarely used bathroom, pour in a mug of water every week or two to keep the seal topped up</w:t>
       </w:r>
     </w:p>
     <w:p>
@@ -355,7 +355,7 @@
           <w:sz w:val="23"/>
           <w:szCs w:val="23"/>
         </w:rPr>
-        <w:t xml:space="preserve">Bullet 3: SS304 MATERIAL &amp; MATTE FINISH</w:t>
+        <w:t xml:space="preserve">Bullet 3: 𝐒𝐒𝟑𝟎𝟒 𝐌𝐀𝐓𝐄𝐑𝐈𝐀𝐋 &amp; 𝐅𝐈𝐍𝐈𝐒𝐇</w:t>
       </w:r>
     </w:p>
     <w:p>
@@ -371,7 +371,7 @@
           <w:sz w:val="18"/>
           <w:szCs w:val="18"/>
         </w:rPr>
-        <w:t xml:space="preserve">565 / 700 characters</w:t>
+        <w:t xml:space="preserve">560 / 700 characters (579 if Amazon counts each bold letter as 2)</w:t>
       </w:r>
     </w:p>
     <w:p>
@@ -393,7 +393,7 @@
           <w:sz w:val="21"/>
           <w:szCs w:val="21"/>
         </w:rPr>
-        <w:t xml:space="preserve">【SS304 MATERIAL &amp; MATTE FINISH】 The channel, reversible cover, strainer, inner bowl and outer trap body are all made from AISI 304 grade stainless steel (SS304), the grade widely used for kitchen and food processing equipment. Built from solid 1 mm thick sheet for a sturdy, rigid feel underfoot, 304 grade steel resists rust and corrosion in daily wet use far better than iron, plastic or lower grade 201 steel. Every edge is folded and deburred, with no sharp edges to cut hands while cleaning, and the premium matte finish helps hide water spots and fingerprints</w:t>
+        <w:t xml:space="preserve">【𝐒𝐒𝟑𝟎𝟒 𝐌𝐀𝐓𝐄𝐑𝐈𝐀𝐋 &amp; 𝐅𝐈𝐍𝐈𝐒𝐇】: The channel, reversible cover, strainer, inner bowl and outer trap body are all made from AISI 304 grade stainless steel (SS304), the grade widely used for kitchen and food processing equipment. Built from solid 1 mm thick sheet for a sturdy, rigid feel underfoot, 304 grade steel resists rust and corrosion in daily wet use far better than iron, plastic or lower grade 201 steel. Every edge is folded and deburred, with no sharp edges to cut hands while cleaning, and the premium matte finish helps hide water spots and fingerprints</w:t>
       </w:r>
     </w:p>
     <w:p>
@@ -410,7 +410,7 @@
           <w:sz w:val="23"/>
           <w:szCs w:val="23"/>
         </w:rPr>
-        <w:t xml:space="preserve">Bullet 4: SIDE HOLE OUTLET &amp; EXACT SIZE</w:t>
+        <w:t xml:space="preserve">Bullet 4: 𝐒𝐈𝐃𝐄 𝐇𝐎𝐋𝐄 𝐎𝐔𝐓𝐋𝐄𝐓 &amp; 𝐒𝐈𝐙𝐄</w:t>
       </w:r>
     </w:p>
     <w:p>
@@ -426,7 +426,7 @@
           <w:sz w:val="18"/>
           <w:szCs w:val="18"/>
         </w:rPr>
-        <w:t xml:space="preserve">539 / 700 characters</w:t>
+        <w:t xml:space="preserve">534 / 700 characters (552 if Amazon counts each bold letter as 2)</w:t>
       </w:r>
     </w:p>
     <w:p>
@@ -448,7 +448,7 @@
           <w:sz w:val="21"/>
           <w:szCs w:val="21"/>
         </w:rPr>
-        <w:t xml:space="preserve">【SIDE HOLE OUTLET &amp; EXACT SIZE】 The 75 mm outlet hole sits to the side, near one end of the channel base instead of the centre, and drains straight down into your pipe. Turn the channel to place the side hole on the left or right, directly over your existing drain pipe. Nominal size 24 x 4 inch, actual outer size 600 x 100 mm, insert area 585 x 85 mm for 10 to 21 mm tile, marble or granite, channel depth 32 mm and total height including trap 85 mm. Confirm outlet position and floor depth with your plumber before the floor bed is laid</w:t>
+        <w:t xml:space="preserve">【𝐒𝐈𝐃𝐄 𝐇𝐎𝐋𝐄 𝐎𝐔𝐓𝐋𝐄𝐓 &amp; 𝐒𝐈𝐙𝐄】: The 75 mm outlet hole sits to the side, near one end of the channel base instead of the centre, and drains straight down into your pipe. Turn the channel to place the side hole on the left or right, directly over your existing drain pipe. Nominal size 24 x 4 inch, actual outer size 600 x 100 mm, insert area 585 x 85 mm for 10 to 21 mm tile, marble or granite, channel depth 32 mm and total height including trap 85 mm. Confirm outlet position and floor depth with your plumber before the floor bed is laid</w:t>
       </w:r>
     </w:p>
     <w:p>
@@ -465,7 +465,7 @@
           <w:sz w:val="23"/>
           <w:szCs w:val="23"/>
         </w:rPr>
-        <w:t xml:space="preserve">Bullet 5: EASY LIFT, RINSE &amp; REFIT CLEANING</w:t>
+        <w:t xml:space="preserve">Bullet 5: 𝐄𝐀𝐒𝐘 𝐂𝐋𝐄𝐀𝐍𝐈𝐍𝐆</w:t>
       </w:r>
     </w:p>
     <w:p>
@@ -481,7 +481,7 @@
           <w:sz w:val="18"/>
           <w:szCs w:val="18"/>
         </w:rPr>
-        <w:t xml:space="preserve">524 / 700 characters</w:t>
+        <w:t xml:space="preserve">505 / 700 characters (517 if Amazon counts each bold letter as 2)</w:t>
       </w:r>
     </w:p>
     <w:p>
@@ -503,7 +503,7 @@
           <w:sz w:val="21"/>
           <w:szCs w:val="21"/>
         </w:rPr>
-        <w:t xml:space="preserve">【EASY LIFT, RINSE &amp; REFIT CLEANING】 Hair and soap residue collect in the removable slotted strainer instead of deep inside your pipe, helping prevent slow drainage and blockages. Lift the cover, take out the strainer and inner bowl, rinse them under running water and drop them back in place. Clean the stainless steel with mild soap and water only; avoid toilet acid, hydrochloric acid and harsh bleach, which can stain any steel. After cleaning, the trap refills with water so the anti smell seal is restored straight away</w:t>
+        <w:t xml:space="preserve">【𝐄𝐀𝐒𝐘 𝐂𝐋𝐄𝐀𝐍𝐈𝐍𝐆】: Hair and soap residue collect in the removable slotted strainer instead of deep inside your pipe, helping prevent slow drainage and blockages. Lift the cover, take out the strainer and inner bowl, rinse them under running water and drop them back in place. Clean the stainless steel with mild soap and water only; avoid toilet acid, hydrochloric acid and harsh bleach, which can stain any steel. After cleaning, the trap refills with water so the anti smell seal is restored straight away</w:t>
       </w:r>
     </w:p>
     <w:p>
@@ -520,7 +520,7 @@
           <w:sz w:val="23"/>
           <w:szCs w:val="23"/>
         </w:rPr>
-        <w:t xml:space="preserve">Bullet 6: IDEAL FOR BATHROOM, SHOWER &amp; BALCONY</w:t>
+        <w:t xml:space="preserve">Bullet 6: 𝐀𝐏𝐏𝐋𝐈𝐂𝐀𝐓𝐈𝐎𝐍 𝐀𝐑𝐄𝐀</w:t>
       </w:r>
     </w:p>
     <w:p>
@@ -536,7 +536,7 @@
           <w:sz w:val="18"/>
           <w:szCs w:val="18"/>
         </w:rPr>
-        <w:t xml:space="preserve">446 / 700 characters</w:t>
+        <w:t xml:space="preserve">427 / 700 characters (442 if Amazon counts each bold letter as 2)</w:t>
       </w:r>
     </w:p>
     <w:p>
@@ -558,7 +558,7 @@
           <w:sz w:val="21"/>
           <w:szCs w:val="21"/>
         </w:rPr>
-        <w:t xml:space="preserve">【IDEAL FOR BATHROOM, SHOWER &amp; BALCONY】 Suits shower areas, walk-in showers, wet rooms, bathrooms, balconies and utility wash areas in new homes and renovations. A stylish upgrade from an ordinary visible bathroom jali when you want a clean, continuous tiled floor. For best results, lay the floor with a gentle slope towards the drain, keep cement and grout out of the outlet, and never grout the cover in place so it stays removable for cleaning</w:t>
+        <w:t xml:space="preserve">【𝐀𝐏𝐏𝐋𝐈𝐂𝐀𝐓𝐈𝐎𝐍 𝐀𝐑𝐄𝐀】: Suits shower areas, walk-in showers, wet rooms, bathrooms, balconies and utility wash areas in new homes and renovations. A stylish upgrade from an ordinary visible bathroom jali when you want a clean, continuous tiled floor. For best results, lay the floor with a gentle slope towards the drain, keep cement and grout out of the outlet, and never grout the cover in place so it stays removable for cleaning</w:t>
       </w:r>
     </w:p>
     <w:p>
@@ -575,7 +575,7 @@
           <w:sz w:val="23"/>
           <w:szCs w:val="23"/>
         </w:rPr>
-        <w:t xml:space="preserve">Bullet 7: 5-PIECE SET &amp; LIFETIME WARRANTY</w:t>
+        <w:t xml:space="preserve">Bullet 7: 𝟓-𝐏𝐈𝐄𝐂𝐄 𝐒𝐄𝐓 &amp; 𝐖𝐀𝐑𝐑𝐀𝐍𝐓𝐘</w:t>
       </w:r>
     </w:p>
     <w:p>
@@ -591,7 +591,7 @@
           <w:sz w:val="18"/>
           <w:szCs w:val="18"/>
         </w:rPr>
-        <w:t xml:space="preserve">440 / 700 characters</w:t>
+        <w:t xml:space="preserve">432 / 700 characters (449 if Amazon counts each bold letter as 2)</w:t>
       </w:r>
     </w:p>
     <w:p>
@@ -613,7 +613,7 @@
           <w:sz w:val="21"/>
           <w:szCs w:val="21"/>
         </w:rPr>
-        <w:t xml:space="preserve">【5-PIECE SET &amp; LIFETIME WARRANTY】 You receive the drain channel, reversible 2-in-1 cover, slotted strainer, inner water seal bowl and outer AquaLock trap body, ready to install. Floor tile or marble for the insert is not included, so you can match it exactly to your own flooring. TAPSA backs the drain channel with a lifetime limited replacement warranty, subject to its written terms, for long term peace of mind from TAPSA Luxury Bathing</w:t>
+        <w:t xml:space="preserve">【𝟓-𝐏𝐈𝐄𝐂𝐄 𝐒𝐄𝐓 &amp; 𝐖𝐀𝐑𝐑𝐀𝐍𝐓𝐘】: You receive the drain channel, reversible 2-in-1 cover, slotted strainer, inner water seal bowl and outer AquaLock trap body, ready to install. Floor tile or marble for the insert is not included, so you can match it exactly to your own flooring. TAPSA backs the drain channel with a lifetime limited replacement warranty, subject to its written terms, for long term peace of mind from TAPSA Luxury Bathing</w:t>
       </w:r>
     </w:p>
     <w:p>

</xml_diff>